<commit_message>
Ground the Studienplan in the verified transcript
Adds the transcript as a verified source and uses it: named module grades
replace generic claims of quantitative ability, the thesis is shown at
twelve credits rather than a bare 1.0, and the programming modules are
cited as the evidence behind the AI tool.

Addresses Mathematics I at 2.9 openly. The transcript is submitted anyway,
so an unaddressed claim of quantitative strength invites doubt; the
improvement to 1.2 in Mathematics II is also the only evidence of the grade
development DAAD names as its own criterion.

Co-Authored-By: Claude Opus 5 <noreply@anthropic.com>
Claude-Session: https://claude.ai/code/session_018EEFYAf6pBJaMga5G9Xzjo
</commit_message>
<xml_diff>
--- a/DAAD_Bewerbung/04_Dokumente/Studienplan_Tim_Roesch.docx
+++ b/DAAD_Bewerbung/04_Dokumente/Studienplan_Tim_Roesch.docx
@@ -75,7 +75,7 @@
           <w:sz w:val="21"/>
           <w:szCs w:val="21"/>
         </w:rPr>
-        <w:t xml:space="preserve">Meine bisherige Ausbildung betrifft die Informationsebene betrieblicher Abläufe. Im Studiengang Wirtschaftsinformatik an der Dualen Hochschule Baden-Württemberg habe ich gelernt, Geschäftsprozesse formal zu modellieren, zu messen und zu verbessern: mit Petri-Netzen, ereignisgesteuerten Prozessketten und BPMN, dazu Prozesscontrolling, Business Process Reengineering, Lean Management und Process Mining, also die Rekonstruktion tatsächlicher Abläufe aus den Datenspuren betrieblicher Systeme.</w:t>
+        <w:t xml:space="preserve">Meine bisherige Ausbildung betrifft die Informationsebene betrieblicher Abläufe. Im Studiengang Wirtschaftsinformatik an der Dualen Hochschule Baden-Württemberg habe ich gelernt, Geschäftsprozesse formal zu modellieren, zu messen und zu verbessern: mit Petri-Netzen, ereignisgesteuerten Prozessketten und BPMN, dazu Prozesscontrolling, Business Process Reengineering, Lean Management und Process Mining, also die Rekonstruktion tatsächlicher Abläufe aus den Datenspuren betrieblicher Systeme. Das zugehörige Modul Geschäftsprozesse und deren Umsetzung habe ich mit 1,0 abgeschlossen. Die technische Seite kommt aus Programmierung I und II, der Entwicklung verteilter Systeme und dem Software-Lebenszyklus.</w:t>
       </w:r>
     </w:p>
     <w:p>
@@ -1146,7 +1146,7 @@
                 <w:sz w:val="18"/>
                 <w:szCs w:val="18"/>
               </w:rPr>
-              <w:t xml:space="preserve">belastbar (Note 1,0 im Fachmodul, Praxisanwendung)</w:t>
+              <w:t xml:space="preserve">belastbar: 1,0 im Fachmodul, mehrfach in der Praxis angewendet</w:t>
             </w:r>
           </w:p>
         </w:tc>
@@ -1212,6 +1212,104 @@
                 <w:sz w:val="18"/>
                 <w:szCs w:val="18"/>
               </w:rPr>
+              <w:t xml:space="preserve">Programmierung, Systementwicklung</w:t>
+            </w:r>
+          </w:p>
+        </w:tc>
+        <w:tc>
+          <w:tcPr>
+            <w:tcW w:type="dxa" w:w="2900"/>
+            <w:tcBorders>
+              <w:top w:val="single" w:color="BFC7D5" w:sz="2"/>
+              <w:left w:val="single" w:color="BFC7D5" w:sz="2"/>
+              <w:bottom w:val="single" w:color="BFC7D5" w:sz="2"/>
+              <w:right w:val="single" w:color="BFC7D5" w:sz="2"/>
+            </w:tcBorders>
+            <w:tcMar>
+              <w:top w:type="dxa" w:w="70"/>
+              <w:left w:type="dxa" w:w="100"/>
+              <w:bottom w:type="dxa" w:w="70"/>
+              <w:right w:type="dxa" w:w="100"/>
+            </w:tcMar>
+          </w:tcPr>
+          <w:p>
+            <w:pPr>
+              <w:spacing w:after="0" w:line="240"/>
+            </w:pPr>
+            <w:r>
+              <w:rPr>
+                <w:rFonts w:ascii="Calibri" w:cs="Calibri" w:eastAsia="Calibri" w:hAnsi="Calibri"/>
+                <w:b w:val="false"/>
+                <w:bCs w:val="false"/>
+                <w:sz w:val="18"/>
+                <w:szCs w:val="18"/>
+              </w:rPr>
+              <w:t xml:space="preserve">belastbar: Programmierung I 1,2, II 1,5, Verteilte Systeme 1,3</w:t>
+            </w:r>
+          </w:p>
+        </w:tc>
+        <w:tc>
+          <w:tcPr>
+            <w:tcW w:type="dxa" w:w="2700"/>
+            <w:tcBorders>
+              <w:top w:val="single" w:color="BFC7D5" w:sz="2"/>
+              <w:left w:val="single" w:color="BFC7D5" w:sz="2"/>
+              <w:bottom w:val="single" w:color="BFC7D5" w:sz="2"/>
+              <w:right w:val="single" w:color="BFC7D5" w:sz="2"/>
+            </w:tcBorders>
+            <w:tcMar>
+              <w:top w:type="dxa" w:w="70"/>
+              <w:left w:type="dxa" w:w="100"/>
+              <w:bottom w:type="dxa" w:w="70"/>
+              <w:right w:type="dxa" w:w="100"/>
+            </w:tcMar>
+          </w:tcPr>
+          <w:p>
+            <w:pPr>
+              <w:spacing w:after="0" w:line="240"/>
+            </w:pPr>
+            <w:r>
+              <w:rPr>
+                <w:rFonts w:ascii="Calibri" w:cs="Calibri" w:eastAsia="Calibri" w:hAnsi="Calibri"/>
+                <w:b w:val="false"/>
+                <w:bCs w:val="false"/>
+                <w:sz w:val="18"/>
+                <w:szCs w:val="18"/>
+              </w:rPr>
+              <w:t xml:space="preserve">Voraussetzung, nicht Lücke</w:t>
+            </w:r>
+          </w:p>
+        </w:tc>
+      </w:tr>
+      <w:tr>
+        <w:tc>
+          <w:tcPr>
+            <w:tcW w:type="dxa" w:w="2600"/>
+            <w:tcBorders>
+              <w:top w:val="single" w:color="BFC7D5" w:sz="2"/>
+              <w:left w:val="single" w:color="BFC7D5" w:sz="2"/>
+              <w:bottom w:val="single" w:color="BFC7D5" w:sz="2"/>
+              <w:right w:val="single" w:color="BFC7D5" w:sz="2"/>
+            </w:tcBorders>
+            <w:tcMar>
+              <w:top w:type="dxa" w:w="70"/>
+              <w:left w:type="dxa" w:w="100"/>
+              <w:bottom w:type="dxa" w:w="70"/>
+              <w:right w:type="dxa" w:w="100"/>
+            </w:tcMar>
+          </w:tcPr>
+          <w:p>
+            <w:pPr>
+              <w:spacing w:after="0" w:line="240"/>
+            </w:pPr>
+            <w:r>
+              <w:rPr>
+                <w:rFonts w:ascii="Calibri" w:cs="Calibri" w:eastAsia="Calibri" w:hAnsi="Calibri"/>
+                <w:b w:val="false"/>
+                <w:bCs w:val="false"/>
+                <w:sz w:val="18"/>
+                <w:szCs w:val="18"/>
+              </w:rPr>
               <w:t xml:space="preserve">Quantitative Analyse, Datenauswertung</w:t>
             </w:r>
           </w:p>
@@ -1244,7 +1342,7 @@
                 <w:sz w:val="18"/>
                 <w:szCs w:val="18"/>
               </w:rPr>
-              <w:t xml:space="preserve">belastbar (Bachelorarbeit, Modellbau in der Praxis)</w:t>
+              <w:t xml:space="preserve">belastbar: Bachelorarbeit 1,0 über 12 Credits, Modellbau in der Praxis</w:t>
             </w:r>
           </w:p>
         </w:tc>
@@ -2791,7 +2889,21 @@
           <w:sz w:val="21"/>
           <w:szCs w:val="21"/>
         </w:rPr>
-        <w:t xml:space="preserve">Der Studiengang richtet sich an quantitativ ausgebildete Absolventinnen und Absolventen mit einschlägiger Praxiserfahrung. Beides bringe ich mit, wenn auch nicht aus einem ingenieurwissenschaftlichen Studium. Meine quantitative Grundlage umfasst Mathematik und Statistik im Studium, die Entwicklung und Validierung eines KI-gestützten Prüfverfahrens sowie Modellbau in der Beratungspraxis. Die Praxiserfahrung stammt aus einem dualen Studium mit drei Jahren Unternehmensphasen und fünf Rotationen, davon eine im Ausland.</w:t>
+        <w:t xml:space="preserve">Der Studiengang richtet sich an quantitativ ausgebildete Absolventinnen und Absolventen mit einschlägiger Praxiserfahrung. Beides bringe ich mit, wenn auch nicht aus einem ingenieurwissenschaftlichen Studium. Meine quantitative Grundlage stützt sich auf die Programmier- und Systemmodule, auf die Bachelorarbeit, die mit zwölf Credits die gewichtigste Einzelleistung des Studiums war und mit 1,0 bewertet wurde, sowie auf den Modellbau in der Beratungspraxis. Die Praxiserfahrung stammt aus einem dualen Studium mit drei Jahren Unternehmensphasen und fünf Rotationen, davon eine im Ausland.</w:t>
+      </w:r>
+    </w:p>
+    <w:p>
+      <w:pPr>
+        <w:spacing w:after="150" w:line="264"/>
+        <w:jc w:val="both"/>
+      </w:pPr>
+      <w:r>
+        <w:rPr>
+          <w:rFonts w:ascii="Calibri" w:cs="Calibri" w:eastAsia="Calibri" w:hAnsi="Calibri"/>
+          <w:sz w:val="21"/>
+          <w:szCs w:val="21"/>
+        </w:rPr>
+        <w:t xml:space="preserve">Eine Stelle in meiner Leistungsübersicht will ich nicht übergehen. Mathematik I habe ich im ersten Studienjahr mit 2,9 abgeschlossen, der schwächsten Note meines Studiums. Ich hatte den Aufwand unterschätzt und die Arbeitsweise aus der Schule fortgeschrieben. Mathematik II habe ich anschließend mit 1,2 abgeschlossen. Was ich daraus gelernt habe, betrifft weniger den Stoff als das Vorgehen, und es hat für den Rest des Studiums getragen: Die quantitativ geprägten Module danach liegen sämtlich im Bereich von 1,1 bis 1,3.</w:t>
       </w:r>
     </w:p>
     <w:p>

</xml_diff>

<commit_message>
Give the Studienplan a single thread and drop own module names and grades
Section 1 now describes what the applicant actually did rather than naming
home modules and grades, which belong in the CV and transcript. It ends on
two observations drawn from that work: the reliability of machine-generated
results, and the missing physical layer.

Those two observations carry through the document and meet again in the
research interest, where the same reliability question is asked of a
machine instead of a document, and the outlook closes on them.

Co-Authored-By: Claude Opus 5 <noreply@anthropic.com>
Claude-Session: https://claude.ai/code/session_018EEFYAf6pBJaMga5G9Xzjo
</commit_message>
<xml_diff>
--- a/DAAD_Bewerbung/04_Dokumente/Studienplan_Tim_Roesch.docx
+++ b/DAAD_Bewerbung/04_Dokumente/Studienplan_Tim_Roesch.docx
@@ -75,7 +75,7 @@
           <w:sz w:val="21"/>
           <w:szCs w:val="21"/>
         </w:rPr>
-        <w:t xml:space="preserve">Meine bisherige Ausbildung betrifft die Informationsebene betrieblicher Abläufe. Im Studiengang Wirtschaftsinformatik an der Dualen Hochschule Baden-Württemberg habe ich gelernt, Geschäftsprozesse formal zu modellieren, zu messen und zu verbessern: mit Petri-Netzen, ereignisgesteuerten Prozessketten und BPMN, dazu Prozesscontrolling, Business Process Reengineering, Lean Management und Process Mining, also die Rekonstruktion tatsächlicher Abläufe aus den Datenspuren betrieblicher Systeme. Das zugehörige Fachmodul habe ich mit 1,0 abgeschlossen, die technische Seite stammt aus den Programmier- und Systemmodulen.</w:t>
+        <w:t xml:space="preserve">Mein Studium der Wirtschaftsinformatik hat mich gelehrt, betriebliche Abläufe als etwas zu betrachten, das sich beschreiben, messen und verbessern lässt. Ich habe Prozesse formal modelliert, mit Petri-Netzen, ereignisgesteuerten Prozessketten und BPMN, ihre Leistung über Kennzahlen gesteuert und mit Process Mining aus den Datenspuren betrieblicher Systeme rekonstruiert, wie sie tatsächlich ablaufen und nicht, wie sie dokumentiert sind. Daneben habe ich programmiert und verteilte Systeme entwickelt, also auch die Seite kennengelernt, auf der solche Abläufe technisch entstehen.</w:t>
       </w:r>
     </w:p>
     <w:p>
@@ -89,7 +89,7 @@
           <w:sz w:val="21"/>
           <w:szCs w:val="21"/>
         </w:rPr>
-        <w:t xml:space="preserve">In der Praxis habe ich diese Methoden bei EY-Parthenon auf industrielle Klienten angewendet, überwiegend in der Automobilbranche. Ich habe Marktsegmente und Erlösmodelle quantifiziert, in einer Financial Due Diligence die Volumen- und Preisannahmen eines globalen Automobilzulieferers geprüft und gemeinsam mit dessen Einkaufsleiter Beschaffungsprozess und Lieferantenbasis analysiert. In einem weiteren Projekt habe ich ein KI-gestütztes Prüfverfahren entwickelt, das Aussagen in Due-Diligence-Berichten gegen ihre Quellen abgleicht. Es erreichte an 139 Aussagen eine Bewertungsgenauigkeit von 94 Prozent und wurde in den laufenden Arbeitsablauf der Teams übernommen.</w:t>
+        <w:t xml:space="preserve">In den Praxisphasen bei EY-Parthenon habe ich diese Methoden auf industrielle Klienten angewendet, überwiegend in der Automobilbranche. Ich habe Marktsegmente und Erlösmodelle quantifiziert, in einer Financial Due Diligence die Volumen- und Preisannahmen eines globalen Automobilzulieferers geprüft und gemeinsam mit dessen Einkaufsleiter Beschaffungsprozess und Lieferantenbasis analysiert. In meiner Abschlussarbeit und einer anschließenden Rotation habe ich ein KI-gestütztes Prüfverfahren entwickelt, das Aussagen in Due-Diligence-Berichten gegen ihre Quellen abgleicht. Es erreichte an 139 Aussagen eine Bewertungsgenauigkeit von 94 Prozent und wurde in den laufenden Arbeitsablauf der Teams übernommen.</w:t>
       </w:r>
     </w:p>
     <w:p>
@@ -103,7 +103,7 @@
           <w:sz w:val="21"/>
           <w:szCs w:val="21"/>
         </w:rPr>
-        <w:t xml:space="preserve">Dabei ist mir wiederholt dieselbe Grenze begegnet. Ich konnte beschreiben, wie ein Unternehmen wirtschaftlich funktioniert, nicht aber, wie es physisch produziert. In der Expertensession zur Lieferantenbasis endete meine Urteilsfähigkeit genau dort, wo Fertigungsverfahren, Anlagenverfügbarkeit und Werkslayout beginnen. Die Kennzahl konnte ich hinterfragen, den Prozess dahinter nicht.</w:t>
+        <w:t xml:space="preserve">Zwei Beobachtungen ziehen sich durch diese Arbeiten, und sie bestimmen mein Studienvorhaben.</w:t>
       </w:r>
     </w:p>
     <w:p>
@@ -117,7 +117,35 @@
           <w:sz w:val="21"/>
           <w:szCs w:val="21"/>
         </w:rPr>
-        <w:t xml:space="preserve">Mein Ziel für die zwölf Monate lässt sich in einem Satz sagen: Ich will industrielle Wertschöpfung auf beiden Ebenen beurteilen können, der informationellen und der physischen, und dabei so weit in die Technologie hineinreichen, dass ich ihre Anwendbarkeit selbst einschätzen kann und sie nicht von anderen übernehmen muss.</w:t>
+        <w:t xml:space="preserve">Die erste betrifft die Verlässlichkeit maschinell erzeugter Ergebnisse. Mein Prüfverfahren ist aus einem praktischen Problem entstanden: Ein Modell erzeugt Aussagen schneller, als ein Mensch sie nachvollziehen kann, und trotzdem wird auf ihrer Grundlage entschieden. Die Frage, wann man einem solchen Ergebnis trauen darf und woran sich das erkennen lässt, hat mich seither nicht losgelassen.</w:t>
+      </w:r>
+    </w:p>
+    <w:p>
+      <w:pPr>
+        <w:spacing w:after="150" w:line="264"/>
+        <w:jc w:val="both"/>
+      </w:pPr>
+      <w:r>
+        <w:rPr>
+          <w:rFonts w:ascii="Calibri" w:cs="Calibri" w:eastAsia="Calibri" w:hAnsi="Calibri"/>
+          <w:sz w:val="21"/>
+          <w:szCs w:val="21"/>
+        </w:rPr>
+        <w:t xml:space="preserve">Die zweite betrifft eine Grenze meiner Ausbildung. Ich konnte beschreiben, wie ein Unternehmen wirtschaftlich funktioniert, nicht aber, wie es physisch produziert. In der Expertensession zur Lieferantenbasis endete meine Urteilsfähigkeit genau dort, wo Fertigungsverfahren, Anlagenverfügbarkeit und Werkslayout beginnen. Die Kennzahl konnte ich hinterfragen, den Prozess dahinter nicht. Meine bisherige Ausbildung betrifft die Informationsebene betrieblicher Abläufe; die physische Ebene fehlt ihr.</w:t>
+      </w:r>
+    </w:p>
+    <w:p>
+      <w:pPr>
+        <w:spacing w:after="150" w:line="264"/>
+        <w:jc w:val="both"/>
+      </w:pPr>
+      <w:r>
+        <w:rPr>
+          <w:rFonts w:ascii="Calibri" w:cs="Calibri" w:eastAsia="Calibri" w:hAnsi="Calibri"/>
+          <w:sz w:val="21"/>
+          <w:szCs w:val="21"/>
+        </w:rPr>
+        <w:t xml:space="preserve">Mein Ziel für die zwölf Monate ergibt sich aus beidem: Ich will industrielle Wertschöpfung auf beiden Ebenen beurteilen können und dabei so weit in die Technologie hineinreichen, dass ich ihre Anwendbarkeit selbst einschätze und sie nicht von anderen übernehmen muss.</w:t>
       </w:r>
     </w:p>
     <w:p>
@@ -1865,7 +1893,7 @@
           <w:sz w:val="21"/>
           <w:szCs w:val="21"/>
         </w:rPr>
-        <w:t xml:space="preserve">Mein Interesse richtet sich auf vernetzte Sensorik und vorausschauende Instandhaltung industrieller Anlagen. Mich beschäftigt daran weniger die Modellbildung selbst als die Frage, unter welchen Bedingungen ihre Ergebnisse im Betrieb tragfähig sind: wann eine Ausfallvorhersage belastbar genug ist, um einen Eingriff zu rechtfertigen, und woran das im laufenden Betrieb erkennbar sein soll. Diese Frage verbindet meine bisherige Arbeit an der Überprüfbarkeit maschinell erzeugter Aussagen mit dem physischen Gegenstand, der mir fehlt.</w:t>
+        <w:t xml:space="preserve">Hier treffen die beiden Beobachtungen aus Abschnitt 1 zusammen. Mein Interesse richtet sich auf vernetzte Sensorik und vorausschauende Instandhaltung industrieller Anlagen. Daran beschäftigt mich weniger die Modellbildung selbst als die Frage, unter welchen Bedingungen ihre Ergebnisse im Betrieb tragfähig sind: wann eine Ausfallvorhersage belastbar genug ist, um einen Eingriff an einer laufenden Anlage zu rechtfertigen, und woran sich das erkennen lässt. Es ist dieselbe Frage nach der Verlässlichkeit maschinell erzeugter Ergebnisse, nur gestellt an einem physischen Gegenstand statt an einem Dokument.</w:t>
       </w:r>
     </w:p>
     <w:p>
@@ -1879,7 +1907,7 @@
           <w:sz w:val="21"/>
           <w:szCs w:val="21"/>
         </w:rPr>
-        <w:t xml:space="preserve">Eine Festlegung nehme ich hier bewusst nicht vor. Die Zuteilung der Forschungsprojekte liegt beim Programm und den Forschungsgruppen, und die Module M3 und M5 werden meine Fragestellung erst präzisieren. Das Modul Research Methods ist dafür die methodische Voraussetzung: Meine Ausbildung ist praxisintegriert verlaufen, und die Bachelorarbeit, bewertet mit 1,0 über zwölf Credits, ist bislang meine einzige längere wissenschaftliche Arbeit.</w:t>
+        <w:t xml:space="preserve">Eine Festlegung nehme ich bewusst nicht vor. Die Zuteilung der Forschungsprojekte liegt beim Programm und den Forschungsgruppen, und die Module Data and Modelling sowie Research Methods werden meine Fragestellung erst präzisieren. Das zweite ist dabei die methodische Voraussetzung. Meine Ausbildung ist praxisintegriert verlaufen, und meine Abschlussarbeit ist bislang die einzige längere wissenschaftliche Arbeit, die ich verfasst habe.</w:t>
       </w:r>
     </w:p>
     <w:p>
@@ -1927,7 +1955,7 @@
           <w:sz w:val="21"/>
           <w:szCs w:val="21"/>
         </w:rPr>
-        <w:t xml:space="preserve">Der MPhil ergänzt meine Ausbildung um die Ebene, die ihr fehlt. Wirtschaftsinformatik liefert die Informationsebene, ISMM die physische Produktionsebene. Das ist kein Fachwechsel. Prozessmodellierung, Programmierung, Datenanalyse und wissenschaftliche Arbeitsweise sind die Voraussetzungen, auf denen das Programm aufbaut, und die bringe ich belegt mit: Notendurchschnitt 1,3, Fachmodul Geschäftsprozesse 1,0, Bachelorarbeit 1,0.</w:t>
+        <w:t xml:space="preserve">Der MPhil ergänzt meine Ausbildung um die Ebene, die ihr fehlt, ohne die aufzugeben, die ich beherrsche. Wirtschaftsinformatik liefert die Informationsebene, ISMM die physische Produktionsebene. Das ist kein Fachwechsel. Prozessmodellierung, Programmierung, Datenanalyse und strukturierte Problembearbeitung sind genau die Voraussetzungen, auf denen das Programm aufbaut.</w:t>
       </w:r>
     </w:p>
     <w:p>
@@ -1970,7 +1998,7 @@
           <w:sz w:val="21"/>
           <w:szCs w:val="21"/>
         </w:rPr>
-        <w:t xml:space="preserve">Das dichteste Element des Jahres ist die Verbindung aus Lehre, vier Projekten und Forschungsarbeit in zwölf Monaten. Ein duales Studium verläuft nach demselben Prinzip, nur über drei Jahre: Theoriephasen und Vollzeitphasen im Unternehmen im Wechsel, mit Prüfungen am Ende jeder Phase. Unter dieser Belastung habe ich einen Schnitt von 1,3 gehalten.</w:t>
+        <w:t xml:space="preserve">Das dichteste Element des Jahres ist die Verbindung aus Lehre, vier Projekten und Forschungsarbeit in zwölf Monaten. Ein duales Studium verläuft nach demselben Prinzip, nur über drei Jahre: Theoriephasen und Vollzeitphasen im Unternehmen im Wechsel, mit Prüfungen am Ende jeder Phase und ohne vorlesungsfreie Zeit dazwischen. Diese Arbeitsform ist mir vertraut.</w:t>
       </w:r>
     </w:p>
     <w:p>
@@ -2013,7 +2041,7 @@
           <w:sz w:val="21"/>
           <w:szCs w:val="21"/>
         </w:rPr>
-        <w:t xml:space="preserve">Nach dem Studium will ich mich an der Schnittstelle von Operations und digitaler Technologie spezialisieren, zunächst in der Strategieberatung, mit dem Ziel, in diesem Feld fachlich eigenständig zu arbeiten. Mittelfristig kann ich mir den Wechsel in ein Industrieunternehmen vorstellen. Der Bedarf ist absehbar: Die Verfahren sind vorhanden, aber ihre Einführung scheitert selten an der Technik und häufig daran, dass niemand beurteilen kann, ob ihren Ergebnissen zu trauen ist. Genau an dieser Stelle möchte ich arbeiten, und dafür brauche ich ein Verständnis der Technologie, das über ihre Anwendung hinausgeht.</w:t>
+        <w:t xml:space="preserve">Nach dem Studium will ich mich an der Schnittstelle von Operations und digitaler Technologie spezialisieren, zunächst in der Strategieberatung, mit dem Ziel, in diesem Feld fachlich eigenständig zu arbeiten. Mittelfristig kann ich mir den Wechsel in ein Industrieunternehmen vorstellen. Der Bedarf ist absehbar: Die Verfahren sind vorhanden, aber ihre Einführung scheitert selten an der Technik und häufig daran, dass niemand beurteilen kann, ob ihren Ergebnissen zu trauen ist. Genau an dieser Stelle möchte ich arbeiten. Es ist dieselbe Frage, mit der dieser Plan beginnt, nur an ihrem praktischen Ende.</w:t>
       </w:r>
     </w:p>
     <w:sectPr>

</xml_diff>

<commit_message>
Raise section 1 to a level a non-specialist reader can follow
Replaces method names and technique lists with a plain account of the dual
degree: what the theory covered, what the five practice phases involved,
and where the applicant's own focus lay. The committee is made up of
professors from other fields, and the call requires the plan to be
intelligible to them.

The two observations that carry the document are kept but stated in
ordinary language.

Co-Authored-By: Claude Opus 5 <noreply@anthropic.com>
Claude-Session: https://claude.ai/code/session_018EEFYAf6pBJaMga5G9Xzjo
</commit_message>
<xml_diff>
--- a/DAAD_Bewerbung/04_Dokumente/Studienplan_Tim_Roesch.docx
+++ b/DAAD_Bewerbung/04_Dokumente/Studienplan_Tim_Roesch.docx
@@ -75,7 +75,7 @@
           <w:sz w:val="21"/>
           <w:szCs w:val="21"/>
         </w:rPr>
-        <w:t xml:space="preserve">Mein Studium der Wirtschaftsinformatik hat mich gelehrt, betriebliche Abläufe als etwas zu betrachten, das sich beschreiben, messen und verbessern lässt. Ich habe Prozesse formal modelliert, mit Petri-Netzen, ereignisgesteuerten Prozessketten und BPMN, ihre Leistung über Kennzahlen gesteuert und mit Process Mining aus den Datenspuren betrieblicher Systeme rekonstruiert, wie sie tatsächlich ablaufen und nicht, wie sie dokumentiert sind. Daneben habe ich programmiert und verteilte Systeme entwickelt, also auch die Seite kennengelernt, auf der solche Abläufe technisch entstehen.</w:t>
+        <w:t xml:space="preserve">Ich habe Wirtschaftsinformatik an der Dualen Hochschule Baden-Württemberg studiert, ein Fach an der Schnittstelle von Betriebswirtschaft und Informatik. Das Studium verläuft dual: Auf jede Theoriephase an der Hochschule folgt eine Vollzeitphase im Partnerunternehmen. Absolviert habe ich es bei EY-Parthenon, der Strategieberatung von EY.</w:t>
       </w:r>
     </w:p>
     <w:p>
@@ -89,7 +89,7 @@
           <w:sz w:val="21"/>
           <w:szCs w:val="21"/>
         </w:rPr>
-        <w:t xml:space="preserve">In den Praxisphasen bei EY-Parthenon habe ich diese Methoden auf industrielle Klienten angewendet, überwiegend in der Automobilbranche. Ich habe Marktsegmente und Erlösmodelle quantifiziert, in einer Financial Due Diligence die Volumen- und Preisannahmen eines globalen Automobilzulieferers geprüft und gemeinsam mit dessen Einkaufsleiter Beschaffungsprozess und Lieferantenbasis analysiert. In meiner Abschlussarbeit und einer anschließenden Rotation habe ich ein KI-gestütztes Prüfverfahren entwickelt, das Aussagen in Due-Diligence-Berichten gegen ihre Quellen abgleicht. Es erreichte an 139 Aussagen eine Bewertungsgenauigkeit von 94 Prozent und wurde in den laufenden Arbeitsablauf der Teams übernommen.</w:t>
+        <w:t xml:space="preserve">In der Theorie habe ich gelernt, wie Unternehmen wirtschaftlich gesteuert werden und wie die technischen Systeme funktionieren, die diese Steuerung tragen. Dazu gehörten Rechnungswesen, Finanzierung und Unternehmensführung ebenso wie Softwareentwicklung, Datenhaltung und quantitative Methoden der Entscheidungsunterstützung. Der eigentliche Schwerpunkt lag für mich dort, wo beides zusammentrifft: bei der Frage, wie betriebliche Abläufe entstehen, wie man sie messbar macht und wie man sie verbessert.</w:t>
       </w:r>
     </w:p>
     <w:p>
@@ -103,7 +103,7 @@
           <w:sz w:val="21"/>
           <w:szCs w:val="21"/>
         </w:rPr>
-        <w:t xml:space="preserve">Zwei Beobachtungen ziehen sich durch diese Arbeiten, und sie bestimmen mein Studienvorhaben.</w:t>
+        <w:t xml:space="preserve">In der Praxis habe ich in fünf Projektphasen überwiegend für industrielle Klienten gearbeitet, schwerpunktmäßig in der Automobilbranche. Ich habe Wachstumspotenziale für einen Automobilkonzern quantifiziert, in einer Unternehmensprüfung die Absatz- und Preisannahmen eines globalen Automobilzulieferers hinterfragt und gemeinsam mit dessen Einkaufsleiter die Beschaffung und die Lieferantenstruktur untersucht. Eine dieser Phasen habe ich in Singapur verbracht. In meiner Abschlussarbeit und einer anschließenden Projektphase habe ich ein KI-gestütztes Prüfverfahren entwickelt, das Aussagen in Beratungsberichten gegen ihre Quellen abgleicht; es erreichte an 139 Aussagen eine Trefferquote von 94 Prozent und wurde von den Teams übernommen.</w:t>
       </w:r>
     </w:p>
     <w:p>
@@ -117,7 +117,7 @@
           <w:sz w:val="21"/>
           <w:szCs w:val="21"/>
         </w:rPr>
-        <w:t xml:space="preserve">Die erste betrifft die Verlässlichkeit maschinell erzeugter Ergebnisse. Mein Prüfverfahren ist aus einem praktischen Problem entstanden: Ein Modell erzeugt Aussagen schneller, als ein Mensch sie nachvollziehen kann, und trotzdem wird auf ihrer Grundlage entschieden. Die Frage, wann man einem solchen Ergebnis trauen darf und woran sich das erkennen lässt, hat mich seither nicht losgelassen.</w:t>
+        <w:t xml:space="preserve">Aus diesen drei Jahren nehme ich zwei Beobachtungen mit, und sie bestimmen mein Studienvorhaben.</w:t>
       </w:r>
     </w:p>
     <w:p>
@@ -131,7 +131,7 @@
           <w:sz w:val="21"/>
           <w:szCs w:val="21"/>
         </w:rPr>
-        <w:t xml:space="preserve">Die zweite betrifft eine Grenze meiner Ausbildung. Ich konnte beschreiben, wie ein Unternehmen wirtschaftlich funktioniert, nicht aber, wie es physisch produziert. In der Expertensession zur Lieferantenbasis endete meine Urteilsfähigkeit genau dort, wo Fertigungsverfahren, Anlagenverfügbarkeit und Werkslayout beginnen. Die Kennzahl konnte ich hinterfragen, den Prozess dahinter nicht. Meine bisherige Ausbildung betrifft die Informationsebene betrieblicher Abläufe; die physische Ebene fehlt ihr.</w:t>
+        <w:t xml:space="preserve">Die erste betrifft den Umgang mit Ergebnissen, die eine Maschine erzeugt hat. Mein Prüfverfahren entstand aus einem praktischen Problem: Ein System liefert Aussagen schneller, als ein Mensch sie nachvollziehen kann, und trotzdem wird auf ihrer Grundlage entschieden. Wann man einem solchen Ergebnis trauen darf und woran sich das erkennen lässt, hat mich seither beschäftigt.</w:t>
       </w:r>
     </w:p>
     <w:p>
@@ -145,7 +145,21 @@
           <w:sz w:val="21"/>
           <w:szCs w:val="21"/>
         </w:rPr>
-        <w:t xml:space="preserve">Mein Ziel für die zwölf Monate ergibt sich aus beidem: Ich will industrielle Wertschöpfung auf beiden Ebenen beurteilen können und dabei so weit in die Technologie hineinreichen, dass ich ihre Anwendbarkeit selbst einschätze und sie nicht von anderen übernehmen muss.</w:t>
+        <w:t xml:space="preserve">Die zweite betrifft eine Grenze meiner Ausbildung. Ich kann beurteilen, wie ein Unternehmen wirtschaftlich funktioniert, nicht aber, wie es physisch produziert. Im Gespräch mit dem Einkaufsleiter endete meine Urteilsfähigkeit genau dort, wo die Fertigung selbst beginnt: bei den Verfahren, den Anlagen und dem, was in einem Werk tatsächlich geschieht. Die Kennzahl konnte ich hinterfragen, den Vorgang dahinter nicht.</w:t>
+      </w:r>
+    </w:p>
+    <w:p>
+      <w:pPr>
+        <w:spacing w:after="150" w:line="264"/>
+        <w:jc w:val="both"/>
+      </w:pPr>
+      <w:r>
+        <w:rPr>
+          <w:rFonts w:ascii="Calibri" w:cs="Calibri" w:eastAsia="Calibri" w:hAnsi="Calibri"/>
+          <w:sz w:val="21"/>
+          <w:szCs w:val="21"/>
+        </w:rPr>
+        <w:t xml:space="preserve">Mein Ziel für die zwölf Monate folgt aus beidem. Ich will industrielle Wertschöpfung nicht nur wirtschaftlich, sondern auch technisch beurteilen können, und ich will so weit in die Technologie hineinreichen, dass ich ihre Anwendbarkeit selbst einschätze, statt sie von anderen zu übernehmen.</w:t>
       </w:r>
     </w:p>
     <w:p>
@@ -178,7 +192,7 @@
           <w:sz w:val="21"/>
           <w:szCs w:val="21"/>
         </w:rPr>
-        <w:t xml:space="preserve">Ich habe mehrere Wege geprüft. Allgemeine Management-Masterprogramme kamen für mich nicht in Frage, weil sie zu breit angelegt sind. Sie hätten mir Methoden hinzugefügt, über die ich nach drei Jahren Beratungspraxis bereits verfüge, und die Lücke gelassen, die mich tatsächlich einschränkt. Wer heute über industrielle Digitalisierung entscheidet, muss die Technologie verstehen und nicht nur ihr Geschäftsmodell. Genau diese Verbindung suche ich.</w:t>
+        <w:t xml:space="preserve">Ich habe mehrere Wege geprüft. Allgemeine Management-Masterprogramme kamen für mich nicht in Frage, weil sie zu breit angelegt sind. Sie hätten mir Methoden hinzugefügt, über die ich nach drei Jahren Beratungspraxis bereits verfüge, und die Lücke gelassen, die mich tatsächlich einschränkt. Wer heute über industrielle Digitalisierung entscheidet, muss die Technologie selbst verstehen und nicht nur ihren wirtschaftlichen Nutzen. Genau diese Verbindung suche ich.</w:t>
       </w:r>
     </w:p>
     <w:p>
@@ -1955,7 +1969,7 @@
           <w:sz w:val="21"/>
           <w:szCs w:val="21"/>
         </w:rPr>
-        <w:t xml:space="preserve">Der MPhil ergänzt meine Ausbildung um die Ebene, die ihr fehlt, ohne die aufzugeben, die ich beherrsche. Wirtschaftsinformatik liefert die Informationsebene, ISMM die physische Produktionsebene. Das ist kein Fachwechsel. Prozessmodellierung, Programmierung, Datenanalyse und strukturierte Problembearbeitung sind genau die Voraussetzungen, auf denen das Programm aufbaut.</w:t>
+        <w:t xml:space="preserve">Der MPhil ergänzt meine Ausbildung um das, was ihr fehlt, ohne aufzugeben, was ich beherrsche. Mein bisheriges Studium betrachtet Unternehmen von ihren Informationen und Zahlen her; dieses Programm ergänzt die Seite der physischen Produktion. Ein Fachwechsel ist das nicht. Betriebswirtschaftliches Verständnis, technische Grundlagen und die Fähigkeit, ein Problem strukturiert zu bearbeiten, sind genau die Voraussetzungen, auf denen das Programm aufbaut.</w:t>
       </w:r>
     </w:p>
     <w:p>

</xml_diff>

<commit_message>
Anchor the Studienplan in the Singapore predictive-maintenance case
Replaces the invented procurement scene with the real origin of the
research interest: the Singapore AI workshop for around thirty shipping and
automotive executives, where the applicant presented a predictive
maintenance case from a client project.

That case now carries the document. It supplies both the fascination and
the honest limit, since he could quantify the value but judge neither the
technique nor the production setting, and the research section names it
directly. The theory is also described as the deliberately broad course it
was rather than a narrower focus.

Co-Authored-By: Claude Opus 5 <noreply@anthropic.com>
Claude-Session: https://claude.ai/code/session_018EEFYAf6pBJaMga5G9Xzjo
</commit_message>
<xml_diff>
--- a/DAAD_Bewerbung/04_Dokumente/Studienplan_Tim_Roesch.docx
+++ b/DAAD_Bewerbung/04_Dokumente/Studienplan_Tim_Roesch.docx
@@ -89,7 +89,7 @@
           <w:sz w:val="21"/>
           <w:szCs w:val="21"/>
         </w:rPr>
-        <w:t xml:space="preserve">In der Theorie habe ich gelernt, wie Unternehmen wirtschaftlich gesteuert werden und wie die technischen Systeme funktionieren, die diese Steuerung tragen. Dazu gehörten Rechnungswesen, Finanzierung und Unternehmensführung ebenso wie Softwareentwicklung, Datenhaltung und quantitative Methoden der Entscheidungsunterstützung. Der eigentliche Schwerpunkt lag für mich dort, wo beides zusammentrifft: bei der Frage, wie betriebliche Abläufe entstehen, wie man sie messbar macht und wie man sie verbessert.</w:t>
+        <w:t xml:space="preserve">Die Theorie war bewusst breit angelegt. Sie reichte von Rechnungswesen, Finanzierung und Unternehmensführung über Softwareentwicklung und Datenhaltung bis zu digitaler Transformation und künstlicher Intelligenz, ergänzt um Service Management, interkulturelle Zusammenarbeit und Wirtschaftsenglisch. Diese Breite halte ich rückblickend für den Wert des Fachs, und mein eigenes Interesse hat sich früh dort verdichtet, wo Technologie auf betriebliche Entscheidungen trifft.</w:t>
       </w:r>
     </w:p>
     <w:p>
@@ -103,7 +103,7 @@
           <w:sz w:val="21"/>
           <w:szCs w:val="21"/>
         </w:rPr>
-        <w:t xml:space="preserve">In der Praxis habe ich in fünf Projektphasen überwiegend für industrielle Klienten gearbeitet, schwerpunktmäßig in der Automobilbranche. Ich habe Wachstumspotenziale für einen Automobilkonzern quantifiziert, in einer Unternehmensprüfung die Absatz- und Preisannahmen eines globalen Automobilzulieferers hinterfragt und gemeinsam mit dessen Einkaufsleiter die Beschaffung und die Lieferantenstruktur untersucht. Eine dieser Phasen habe ich in Singapur verbracht. In meiner Abschlussarbeit und einer anschließenden Projektphase habe ich ein KI-gestütztes Prüfverfahren entwickelt, das Aussagen in Beratungsberichten gegen ihre Quellen abgleicht; es erreichte an 139 Aussagen eine Trefferquote von 94 Prozent und wurde von den Teams übernommen.</w:t>
+        <w:t xml:space="preserve">In der Praxis habe ich in fünf Projektphasen überwiegend für industrielle Klienten gearbeitet, schwerpunktmäßig in der Automobilbranche: Wachstumspotenziale für einen Automobilkonzern quantifiziert, in einer Unternehmensprüfung die Absatz- und Preisannahmen eines globalen Zulieferers hinterfragt, dessen Beschaffung und Lieferantenstruktur untersucht. Parallel dazu habe ich in meiner Abschlussarbeit und einer anschließenden Projektphase ein KI-gestütztes Prüfverfahren entwickelt, das Aussagen in Beratungsberichten gegen ihre Quellen abgleicht; es erreichte an 139 Aussagen eine Trefferquote von 94 Prozent und wurde von den Teams übernommen.</w:t>
       </w:r>
     </w:p>
     <w:p>
@@ -117,7 +117,7 @@
           <w:sz w:val="21"/>
           <w:szCs w:val="21"/>
         </w:rPr>
-        <w:t xml:space="preserve">Aus diesen drei Jahren nehme ich zwei Beobachtungen mit, und sie bestimmen mein Studienvorhaben.</w:t>
+        <w:t xml:space="preserve">Die für dieses Vorhaben entscheidende Phase war Singapur. Ich habe dort einen Workshop zu künstlicher Intelligenz mit rund dreißig Führungskräften aus der Schifffahrt und der Automobilindustrie konzipiert und moderiert. Vorgestellt habe ich unter anderem einen Anwendungsfall aus einem früheren Kundenprojekt, an dem ich mitgearbeitet hatte: eine vorausschauende Instandhaltung für Schiffe. Drohnen umkreisen den Rumpf und erfassen fortlaufend seinen Zustand, dieselbe Logik greift bei den Motoren; auffällige Stellen erkennt eine Bildauswertung, die zuständige Person sieht sie auf einem Dashboard und kann den Schaden beheben, bevor er zum Ausfall führt. Der Nutzen liegt in der vermiedenen Stillstandszeit.</w:t>
       </w:r>
     </w:p>
     <w:p>
@@ -131,7 +131,7 @@
           <w:sz w:val="21"/>
           <w:szCs w:val="21"/>
         </w:rPr>
-        <w:t xml:space="preserve">Die erste betrifft den Umgang mit Ergebnissen, die eine Maschine erzeugt hat. Mein Prüfverfahren entstand aus einem praktischen Problem: Ein System liefert Aussagen schneller, als ein Mensch sie nachvollziehen kann, und trotzdem wird auf ihrer Grundlage entschieden. Wann man einem solchen Ergebnis trauen darf und woran sich das erkennen lässt, hat mich seither beschäftigt.</w:t>
+        <w:t xml:space="preserve">Diese Technologie hat mich seither nicht losgelassen, und an ihr ist mir zugleich meine eigene Grenze klar geworden. Ich konnte den Anwendungsfall darstellen und seinen wirtschaftlichen Wert beziffern. Beurteilen konnte ich ihn nicht: weder das technische Verfahren, das dahintersteht, noch die Produktionsumgebung, in der es wirken soll. Mein Studium betrachtet Unternehmen von ihren Informationen und Zahlen her. Was physisch hergestellt wird und wie, bleibt darin eine Leerstelle.</w:t>
       </w:r>
     </w:p>
     <w:p>
@@ -145,7 +145,7 @@
           <w:sz w:val="21"/>
           <w:szCs w:val="21"/>
         </w:rPr>
-        <w:t xml:space="preserve">Die zweite betrifft eine Grenze meiner Ausbildung. Ich kann beurteilen, wie ein Unternehmen wirtschaftlich funktioniert, nicht aber, wie es physisch produziert. Im Gespräch mit dem Einkaufsleiter endete meine Urteilsfähigkeit genau dort, wo die Fertigung selbst beginnt: bei den Verfahren, den Anlagen und dem, was in einem Werk tatsächlich geschieht. Die Kennzahl konnte ich hinterfragen, den Vorgang dahinter nicht.</w:t>
+        <w:t xml:space="preserve">Dazu kommt eine zweite Frage, die aus meiner eigenen Entwicklungsarbeit stammt. Ein System liefert Ergebnisse schneller, als ein Mensch sie nachvollziehen kann, und trotzdem wird auf ihrer Grundlage entschieden. Wann man einem solchen Ergebnis trauen darf und woran sich das erkennen lässt, war die praktische Ausgangsfrage meines Prüfverfahrens. Bei einer Instandhaltungsvorhersage stellt sie sich schärfer, weil die Folge ein Eingriff an einer laufenden Anlage ist.</w:t>
       </w:r>
     </w:p>
     <w:p>
@@ -1907,7 +1907,7 @@
           <w:sz w:val="21"/>
           <w:szCs w:val="21"/>
         </w:rPr>
-        <w:t xml:space="preserve">Hier treffen die beiden Beobachtungen aus Abschnitt 1 zusammen. Mein Interesse richtet sich auf vernetzte Sensorik und vorausschauende Instandhaltung industrieller Anlagen. Daran beschäftigt mich weniger die Modellbildung selbst als die Frage, unter welchen Bedingungen ihre Ergebnisse im Betrieb tragfähig sind: wann eine Ausfallvorhersage belastbar genug ist, um einen Eingriff an einer laufenden Anlage zu rechtfertigen, und woran sich das erkennen lässt. Es ist dieselbe Frage nach der Verlässlichkeit maschinell erzeugter Ergebnisse, nur gestellt an einem physischen Gegenstand statt an einem Dokument.</w:t>
+        <w:t xml:space="preserve">Mein Interesse richtet sich auf vernetzte Sensorik und vorausschauende Instandhaltung von Maschinen und Anlagen, also auf die Technologie, die ich in Singapur vertreten habe, ohne sie beurteilen zu können. Daran beschäftigt mich weniger die Modellbildung selbst als die Frage, unter welchen Bedingungen ihre Ergebnisse im Betrieb tragfähig sind: wann eine Ausfallvorhersage belastbar genug ist, um einen Eingriff an einer laufenden Anlage zu rechtfertigen, und woran sich das erkennen lässt. Damit treffen die beiden Linien aus Abschnitt 1 zusammen, die fehlende Produktionsebene und die Frage nach der Verlässlichkeit maschinell erzeugter Ergebnisse.</w:t>
       </w:r>
     </w:p>
     <w:p>

</xml_diff>

<commit_message>
Land the finished motivation letter
Six paragraphs, 761 words of body text, no em dashes, sentence lengths
spread from three to forty-two words.

Co-Authored-By: Claude Opus 5 <noreply@anthropic.com>
Claude-Session: https://claude.ai/code/session_018EEFYAf6pBJaMga5G9Xzjo
</commit_message>
<xml_diff>
--- a/DAAD_Bewerbung/04_Dokumente/Studienplan_Tim_Roesch.docx
+++ b/DAAD_Bewerbung/04_Dokumente/Studienplan_Tim_Roesch.docx
@@ -89,7 +89,7 @@
           <w:sz w:val="22"/>
           <w:szCs w:val="22"/>
         </w:rPr>
-        <w:t xml:space="preserve">Die Theorie war bewusst breit angelegt. Sie reichte von Rechnungswesen, Finanzierung und Unternehmensführung über Softwareentwicklung und Datenhaltung bis zu digitaler Transformation und künstlicher Intelligenz, ergänzt um Service Management, interkulturelle Zusammenarbeit und Wirtschaftsenglisch. Diese Breite halte ich rückblickend für den Wert des Fachs, und mein eigenes Interesse hat sich früh dort verdichtet, wo Technologie auf betriebliche Entscheidungen trifft.</w:t>
+        <w:t xml:space="preserve">Die Theorie war bewusst breit angelegt. Sie reichte von der kaufmännischen Seite, also Rechnungswesen, Finanzierung und Unternehmenssteuerung, bis zur technischen, also Programmierung, Datenbanken und künstliche Intelligenz. Diese Breite halte ich rückblickend für den Wert des Fachs, und mein eigenes Interesse hat sich früh dort verdichtet, wo Technologie auf betriebliche Entscheidungen trifft.</w:t>
       </w:r>
     </w:p>
     <w:p>
@@ -145,7 +145,7 @@
           <w:sz w:val="22"/>
           <w:szCs w:val="22"/>
         </w:rPr>
-        <w:t xml:space="preserve">Im Workshop kam eine Frage auf, die ich damals nur ausweichend beantworten konnte. Ein Betriebsleiter wollte wissen, ab wann er einer solchen Vorhersage genug traut, um eine laufende Anlage anzuhalten. Die Frage ist berechtigt, denn ein Fehlalarm kostet Produktionszeit und eine übersehene Schädigung kostet mehr. Beantworten lässt sie sich nur, wenn man weiß, wie zuverlässig das Verfahren unter den Bedingungen dieser einen Anlage arbeitet. Genau dieses Urteil konnte ich nicht abgeben.</w:t>
+        <w:t xml:space="preserve">Im Workshop kam eine Frage auf, die ich nur ausweichend beantworten konnte. Ein Betriebsleiter wollte wissen, ab wann er einer solchen Vorhersage genug traut, um eine laufende Anlage anzuhalten. Ein Fehlalarm kostet Produktionszeit, eine übersehene Schädigung kostet mehr. Beantworten lässt sich das nur, wenn man weiß, wie zuverlässig das Verfahren unter den Bedingungen dieser einen Anlage arbeitet. Dieses Urteil konnte ich nicht abgeben.</w:t>
       </w:r>
     </w:p>
     <w:p>
@@ -159,7 +159,7 @@
           <w:sz w:val="22"/>
           <w:szCs w:val="22"/>
         </w:rPr>
-        <w:t xml:space="preserve">Mein Ziel für die zwölf Monate in Cambridge folgt aus beidem. Ich will industrielle Wertschöpfung auch technisch beurteilen können und nicht nur wirtschaftlich. Und ich will so weit in die Technologie hineinreichen, dass ich ihre Anwendbarkeit in einer konkreten Fertigung selbst einschätze, statt diese Einschätzung von anderen zu übernehmen. Ein Jahr, das Fertigungsverfahren, Lieferketten und Datenmodellierung zusammen unterrichtet und beides in Unternehmen erproben lässt, ist dafür der kürzeste Weg, den ich gefunden habe.</w:t>
+        <w:t xml:space="preserve">Mein Ziel für die zwölf Monate in Cambridge folgt aus beidem. Ich will industrielle Wertschöpfung auch technisch beurteilen können und nicht nur wirtschaftlich. Und ich will so weit in die Technologie hineinreichen, dass ich ihre Anwendbarkeit in einer konkreten Fertigung selbst einschätze, statt diese Einschätzung von anderen zu übernehmen.</w:t>
       </w:r>
     </w:p>
     <w:p>
@@ -757,7 +757,7 @@
                 <w:sz w:val="18"/>
                 <w:szCs w:val="18"/>
               </w:rPr>
-              <w:t xml:space="preserve">Auswertung und Modellierung von Fertigungsdaten: Stichprobenbildung, Regression, Mustererkennung in großen Datenbeständen, Simulation und Sensitivitätsanalyse, also die Prüfung, wie stark ein Ergebnis von einzelnen Annahmen abhängt; strukturiertes Vorgehen bei Managementproblemen einschließlich der Grenzen der Verfahren</w:t>
+              <w:t xml:space="preserve">Auswertung und Modellierung von Fertigungsdaten: Stichprobenbildung, Regression, Mustererkennung in großen Datenbeständen, Simulation und Sensitivitätsanalyse, also die Prüfung, wie stark ein Ergebnis von einzelnen Annahmen abhängt; strukturiertes Vorgehen bei Managementproblemen samt ihrer Grenzen</w:t>
             </w:r>
           </w:p>
         </w:tc>
@@ -855,7 +855,7 @@
                 <w:sz w:val="18"/>
                 <w:szCs w:val="18"/>
               </w:rPr>
-              <w:t xml:space="preserve">Unternehmensgründung, Unternehmensstrategie, Vertrieb und Marketing sowie Design Innovation, also die methodische Gestaltung neuer Produkte und Angebote</w:t>
+              <w:t xml:space="preserve">Unternehmensgründung, Unternehmensstrategie, Vertrieb und Marketing sowie Design Innovation, also die methodische Gestaltung neuer Angebote</w:t>
             </w:r>
           </w:p>
         </w:tc>
@@ -1051,7 +1051,7 @@
                 <w:sz w:val="18"/>
                 <w:szCs w:val="18"/>
               </w:rPr>
-              <w:t xml:space="preserve">Ein Wahlmodul ergänzt die Kernmodule. Es wird nach der Einführungsphase im Gespräch mit dem Studiengang festgelegt; eine Festlegung zwölf Monate im Voraus erscheint mir nicht seriös</w:t>
+              <w:t xml:space="preserve">Wird nach der Einführungsphase im Gespräch mit dem Studiengang festgelegt; eine Wahl zwölf Monate im Voraus erscheint mir nicht seriös</w:t>
             </w:r>
           </w:p>
         </w:tc>
@@ -1105,7 +1105,7 @@
           <w:sz w:val="22"/>
           <w:szCs w:val="22"/>
         </w:rPr>
-        <w:t xml:space="preserve">Zur Frage der Credit Points: Cambridge weist für diesen Abschluss keine ECTS-Punkte aus, weder im offiziellen Programmtext noch in den Prüfungsordnungen. Der Arbeitsaufwand entspricht einem vollen Masterjahr in Vollzeit über zwölf Monate ohne vorlesungsfreie Zeit. Ich gebe deshalb für jede Veranstaltung die Prüfungsform an, statt eine Punktzahl zu errechnen, die es nicht gibt. Bewertet wird insgesamt über die Modularbeiten zu den Kernmodulen und zum Wahlmodul, über je eine Bewertung pro Industrieprojekt, über einen zusammenführenden Abschlussessay und über die Dissertation von bis zu 15.000 Wörtern.</w:t>
+        <w:t xml:space="preserve">Zur Frage der Credit Points: Cambridge weist für diesen Abschluss keine ECTS-Punkte aus. Der Arbeitsaufwand entspricht einem vollen Masterjahr in Vollzeit über zwölf Monate ohne vorlesungsfreie Zeit. Ich gebe deshalb für jede Veranstaltung die Prüfungsform an, statt eine Punktzahl zu errechnen, die es nicht gibt. Bewertet wird über die Modularbeiten, über je eine Bewertung pro Industrieprojekt, über einen zusammenführenden Abschlussessay und über die Dissertation von bis zu 15.000 Wörtern.</w:t>
       </w:r>
     </w:p>
     <w:p>
@@ -1956,7 +1956,7 @@
           <w:sz w:val="22"/>
           <w:szCs w:val="22"/>
         </w:rPr>
-        <w:t xml:space="preserve">Die Gastunternehmen kommen aus der Automobil- und Luftfahrtindustrie, aus Öl und Gas, aus der Lebensmittel- und Getränkeherstellung und aus dem Konsumgütergeschäft. Die Themen reichen von Produktionsplanung, Terminierung und Bestandsoptimierung über Kapazitätsauslastung, Durchlaufzeiten und Qualität bis zu Fragen der Eigenfertigung gegen Fremdbezug, der Instandhaltung, des Energieverbrauchs und der Flächenplanung einer Halle. Soweit die Zuteilung es zulässt, möchte ich meine Projekte auf Produktionsplanung, Bestandsoptimierung und Instandhaltung richten, weil an diesen drei Stellen Daten und physischer Prozess unmittelbar aufeinandertreffen.</w:t>
+        <w:t xml:space="preserve">Die Gastunternehmen kommen aus der Automobil- und Luftfahrtindustrie, aus Öl und Gas, aus der Lebensmittelherstellung und aus dem Konsumgütergeschäft. Die Themen reichen von Produktionsplanung und Bestandsoptimierung über Kapazitätsauslastung, Durchlaufzeiten und Qualität bis zu Eigenfertigung gegen Fremdbezug, Instandhaltung und Energieverbrauch. Soweit die Zuteilung es zulässt, möchte ich meine Projekte auf Produktionsplanung, Bestandsoptimierung und Instandhaltung richten, weil an diesen Stellen Daten und physischer Prozess unmittelbar aufeinandertreffen.</w:t>
       </w:r>
     </w:p>
     <w:p>
@@ -1970,7 +1970,7 @@
           <w:sz w:val="22"/>
           <w:szCs w:val="22"/>
         </w:rPr>
-        <w:t xml:space="preserve">Einbringen kann ich die Fähigkeit, in wenigen Tagen ein unscharfes Problem zu rahmen und ein Ergebnis so aufzubereiten, dass ein Führungsgremium damit entscheiden kann. Genau das war der Inhalt meiner Praxisphasen bei EY-Parthenon, zuletzt in Singapur. Die Vorgabe des Programms, mit einer einseitigen Aufgabenbeschreibung anzureisen und binnen zweier Wochen Empfehlungen an die Geschäftsleitung zu richten, beschreibt eine Arbeitsweise, in der ich geübt bin. Neu ist für mich nicht das Format, sondern der Gegenstand: die Halle statt der Tabelle.</w:t>
+        <w:t xml:space="preserve">Einbringen kann ich die Fähigkeit, in wenigen Tagen ein unscharfes Problem zu rahmen und ein Ergebnis so aufzubereiten, dass ein Führungsgremium damit entscheiden kann. Das war der Inhalt meiner Praxisphasen bei EY-Parthenon, zuletzt in Singapur. Mit einer einseitigen Aufgabenbeschreibung anzureisen und binnen zweier Wochen Empfehlungen an die Geschäftsleitung zu richten, ist eine Arbeitsweise, in der ich geübt bin. Neu wäre für mich der Gegenstand: die Halle statt der Tabelle.</w:t>
       </w:r>
     </w:p>
     <w:p>
@@ -1999,7 +1999,7 @@
           <w:sz w:val="22"/>
           <w:szCs w:val="22"/>
         </w:rPr>
-        <w:t xml:space="preserve">Zum Jahrgang gehören rund dreißig Besuche bei Unternehmen unterschiedlicher Größe, verteilt über Luftfahrt, Automobilbau, Getränke, Chemie, Konsumgüter, Verteidigung, Elektronik, Energie, Lebensmittel, Gesundheitswirtschaft, Messtechnik, Metallverarbeitung, Pharma und Textil. Jeder Besuch folgt demselben Muster: Das Unternehmen stellt Geschichte, Markt, Strategie und Betriebsabläufe dar, danach folgt eine Führung durch die Fertigung und zum Schluss eine offene Runde mit dem Management.</w:t>
+        <w:t xml:space="preserve">Zum Jahrgang gehören rund dreißig Besuche bei Unternehmen unterschiedlicher Größe, verteilt über Luftfahrt, Automobilbau, Chemie, Konsumgüter, Verteidigung, Elektronik, Energie, Lebensmittel, Gesundheitswirtschaft, Messtechnik, Metallverarbeitung, Pharma und Textil. Jeder Besuch folgt demselben Muster: Das Unternehmen stellt Geschichte, Markt, Strategie und Betriebsabläufe dar, danach folgt eine Führung durch die Fertigung und zum Schluss eine offene Runde mit dem Management.</w:t>
       </w:r>
     </w:p>
     <w:p>
@@ -2013,7 +2013,7 @@
           <w:sz w:val="22"/>
           <w:szCs w:val="22"/>
         </w:rPr>
-        <w:t xml:space="preserve">Für mich ist das der wichtigste einzelne Bestandteil des Jahres, und zwar aus einem nüchternen Grund. Ich habe in meiner bisherigen Arbeit viele Werke als Zahlenwerk gesehen und keines von innen. Wie eine Linie tatsächlich getaktet ist, wo sich Bestände aufbauen, welche Arbeitsschritte von Menschen und welche von Maschinen ausgeführt werden und wo ein Betrieb seine Sensoren überhaupt anbringen kann, erschließt sich aus Unterlagen nicht. Dreißig Werke in einem Jahr, jedes mit der Möglichkeit, dem Werkleiter Fragen zu stellen, ersetzen in dieser Hinsicht mehrere Jahre Berufserfahrung.</w:t>
+        <w:t xml:space="preserve">Für mich ist das aus einem nüchternen Grund der wichtigste einzelne Bestandteil des Jahres. Ich habe in meiner bisherigen Arbeit viele Werke als Zahlenwerk gesehen und keines von innen. Wie eine Linie getaktet ist, wo sich Bestände aufbauen, welche Schritte Menschen und welche Maschinen ausführen und wo ein Betrieb seine Sensoren überhaupt anbringen kann, erschließt sich aus Unterlagen nicht. Dreißig Werke in einem Jahr, jedes mit der Möglichkeit, dem Werkleiter Fragen zu stellen, ersetzen hier mehrere Jahre Berufserfahrung.</w:t>
       </w:r>
     </w:p>
     <w:p>
@@ -2027,7 +2027,7 @@
           <w:sz w:val="22"/>
           <w:szCs w:val="22"/>
         </w:rPr>
-        <w:t xml:space="preserve">Im April oder Mai steht eine Auslandsstudienreise an, für die in der Regel zwei Ziele zur Wahl stehen, eines in Europa und eines weiter entfernt. Jede Reise trägt ein fachliches Thema und endet mit einem Bericht und einem gemeinsamen Auswertungsseminar. Frühere Reisen haben sich unter anderem mit der Frage befasst, ob die vierte industrielle Revolution die Lieferkette wirklich verbessert oder überwiegend ein Versprechen bleibt, und mit dem Internet der Dinge, also der Vernetzung von Maschinen und Bauteilen über Sensoren. Eine Reise, die an dieses Thema anschließt, wäre für mein Vorhaben die naheliegende Wahl.</w:t>
+        <w:t xml:space="preserve">Im April oder Mai steht eine Auslandsstudienreise an, meist mit zwei Zielen zur Wahl, eines in Europa und eines weiter entfernt. Jede Reise trägt ein fachliches Thema und endet mit einem Bericht und einem gemeinsamen Auswertungsseminar. Frühere Reisen befassten sich unter anderem mit der Frage, ob die vierte industrielle Revolution die Lieferkette wirklich verbessert oder überwiegend ein Versprechen bleibt, und mit dem Internet der Dinge, also der Vernetzung von Maschinen und Bauteilen über Sensoren. Eine Reise mit diesem Schwerpunkt wäre für mich die naheliegende Wahl.</w:t>
       </w:r>
     </w:p>
     <w:p>
@@ -2787,7 +2787,7 @@
           <w:sz w:val="22"/>
           <w:szCs w:val="22"/>
         </w:rPr>
-        <w:t xml:space="preserve">Das Jahr endet mit einem individuellen Forschungsprojekt über fünfzehn Wochen, das in einer Dissertation von bis zu 15.000 Wörtern mündet. Abgeschlossen wird es durch eine Forschungskonferenz, auf der jede Arbeit vor den Mitstudierenden und den Betreuenden vorgetragen und verteidigt wird. Die Themen stammen aus den Forschungsgruppen des Institute for Manufacturing, das Fertigungsforschung und Managementforschung unter einem Dach betreibt. Für mein Interesse einschlägig sind vor allem zwei dieser Gruppen: Distributed Information and Automation, die sich mit verteilter Information und Automatisierung in der Produktion befasst, und Industrial Sustainability, die den Ressourcen- und Energieeinsatz industrieller Prozesse untersucht.</w:t>
+        <w:t xml:space="preserve">Das Jahr endet mit einem individuellen Forschungsprojekt über fünfzehn Wochen, das in einer Dissertation von bis zu 15.000 Wörtern mündet. Abgeschlossen wird es durch eine Forschungskonferenz, auf der jede Arbeit vor den Mitstudierenden und den Betreuenden vorgetragen und verteidigt wird. Die Themen stammen aus den Forschungsgruppen des Institute for Manufacturing. Für mein Interesse einschlägig sind vor allem zwei davon: Distributed Information and Automation, die sich mit verteilter Information und Automatisierung in der Produktion befasst, und Industrial Sustainability, die den Ressourcen- und Energieeinsatz industrieller Prozesse untersucht.</w:t>
       </w:r>
     </w:p>
     <w:p>
@@ -2801,7 +2801,7 @@
           <w:sz w:val="22"/>
           <w:szCs w:val="22"/>
         </w:rPr>
-        <w:t xml:space="preserve">Dass mein Interesse dort anschlussfähig ist, lässt sich an früheren Arbeiten des Studiengangs ablesen. Vorgelegt wurden unter anderem eine Untersuchung zur automatischen Fehlerdiagnose an Gasturbinen mit Verfahren des maschinellen Lernens, eine Arbeit über digitale Zwillinge, also fortlaufend mit Messdaten gespeiste Abbilder realer Anlagen, und eine Arbeit über Produktionssysteme, in denen Mensch und rechnergestützte Steuerung eng verzahnt arbeiten. Das sind die Fragen, die mich beschäftigen, und sie werden hier nicht als Ausnahme behandelt, sondern gehören zum üblichen Themenspektrum.</w:t>
+        <w:t xml:space="preserve">Dass mein Interesse dort anschlussfähig ist, lässt sich an früheren Arbeiten des Studiengangs ablesen. Vorgelegt wurden unter anderem eine Untersuchung zur automatischen Fehlerdiagnose an Gasturbinen mit Verfahren des maschinellen Lernens, eine Arbeit über digitale Zwillinge, also fortlaufend mit Messdaten gespeiste Abbilder realer Anlagen, und eine Arbeit über Produktionssysteme, in denen Mensch und rechnergestützte Steuerung eng verzahnt arbeiten. Das sind meine Fragen, und sie gehören hier zum üblichen Themenspektrum.</w:t>
       </w:r>
     </w:p>
     <w:p>
@@ -2829,7 +2829,7 @@
           <w:sz w:val="22"/>
           <w:szCs w:val="22"/>
         </w:rPr>
-        <w:t xml:space="preserve">Eine Festlegung nehme ich bewusst nicht vor, und einen Arbeitsplan lege ich nicht vor. Die Zuteilung der Forschungsprojekte liegt beim Programm und den Forschungsgruppen, und ich halte es für die sachlich richtige Reihenfolge, zuerst Fertigungsverfahren und Datenmodellierung zu lernen und die Fragestellung danach zu schärfen. Das Modul Research Methods ist dafür die methodische Voraussetzung, und ich brauche es. Meine Ausbildung ist praxisintegriert verlaufen; meine Abschlussarbeit ist bislang die einzige längere wissenschaftliche Arbeit, die ich verfasst habe. Der Schritt vom anwendungsnahen Projekt zur eigenständigen Forschungsarbeit ist für mich der anspruchsvollste des ganzen Jahres, und er ist ein Grund, warum ich dieses Programm will.</w:t>
+        <w:t xml:space="preserve">Eine Festlegung nehme ich bewusst nicht vor. Die Zuteilung der Forschungsprojekte liegt beim Programm und den Forschungsgruppen, und ich halte es für die richtige Reihenfolge, zuerst Fertigungsverfahren und Datenmodellierung zu lernen und die Fragestellung danach zu schärfen. Das Modul Research Methods ist dafür die methodische Voraussetzung, und ich brauche es: Meine Ausbildung ist praxisintegriert verlaufen, meine Abschlussarbeit ist bislang die einzige längere wissenschaftliche Arbeit, die ich verfasst habe. Der Schritt zur eigenständigen Forschungsarbeit ist für mich der anspruchsvollste des Jahres.</w:t>
       </w:r>
     </w:p>
     <w:p>
@@ -2891,7 +2891,7 @@
           <w:sz w:val="22"/>
           <w:szCs w:val="22"/>
         </w:rPr>
-        <w:t xml:space="preserve">Die einzelnen Bausteine greifen dabei sichtbar ineinander. Manufacturing Processes liefert mir die physische Ebene, die mir fehlt. Operations and Supply Chain Management verbindet sie mit den Steuerungsfragen, die ich aus der Beratung kenne. Data and Modelling ist die Brücke von meiner Programmier- und Analyseerfahrung zu Fertigungsdaten. Research Methods und die Dissertation führen mich zum ersten Mal in eigenständiges wissenschaftliches Arbeiten, und die Projekte und Werksbesuche halten das Ganze an der industriellen Wirklichkeit.</w:t>
+        <w:t xml:space="preserve">Die Bausteine greifen dabei ineinander. Manufacturing Processes liefert die physische Ebene, die mir fehlt. Operations and Supply Chain Management verbindet sie mit den Steuerungsfragen, die ich aus der Beratung kenne. Data and Modelling ist die Brücke von meiner Programmier- und Analyseerfahrung zu Fertigungsdaten. Research Methods und die Dissertation führen mich erstmals in eigenständiges wissenschaftliches Arbeiten.</w:t>
       </w:r>
     </w:p>
     <w:p>
@@ -2920,7 +2920,7 @@
           <w:sz w:val="22"/>
           <w:szCs w:val="22"/>
         </w:rPr>
-        <w:t xml:space="preserve">Der Studiengang richtet sich an quantitativ ausgebildete Absolventinnen und Absolventen mit einschlägiger Praxiserfahrung. Beides bringe ich mit, wenn auch nicht aus einem ingenieurwissenschaftlichen Studium. Die Praxiserfahrung stammt aus einem dualen Studium mit drei Jahren Unternehmensphasen, davon eine im Ausland. Die Unterrichtssprache ist Englisch; ich habe dreieinhalb Jahre auf Englisch gearbeitet, in Singapur ausschließlich.</w:t>
+        <w:t xml:space="preserve">Der Studiengang richtet sich an quantitativ ausgebildete Absolventen mit einschlägiger Praxiserfahrung. Beides bringe ich mit, wenn auch nicht aus einem ingenieurwissenschaftlichen Studium. Die Unterrichtssprache ist Englisch; ich habe drei Jahre auf Englisch gearbeitet, in Singapur ausschließlich.</w:t>
       </w:r>
     </w:p>
     <w:p>
@@ -2948,7 +2948,7 @@
           <w:sz w:val="22"/>
           <w:szCs w:val="22"/>
         </w:rPr>
-        <w:t xml:space="preserve">Die Zeit bis zum Studienbeginn nutze ich zur Vorbereitung. Ab Januar 2027 vertiefe ich im Rahmen eines Praktikums bei der Boston Consulting Group im Bereich Digital and Tech den Sektor Industrial Goods; im Frühjahr folgt ein Praktikum im Regionalbüro der Friedrich-Naumann-Stiftung in Washington, D.C. Parallel arbeite ich an den fertigungstechnischen Grundlagen, die mir fehlen, vor allem an Werkstoffkunde und den gängigen Umform- und Fügeverfahren.</w:t>
+        <w:t xml:space="preserve">Die Zeit bis zum Studienbeginn nutze ich zur Vorbereitung. Ab Januar 2027 vertiefe ich in einem Praktikum bei der Boston Consulting Group im Bereich Digital and Tech den Sektor Industrial Goods; im Frühjahr folgt ein Praktikum im Regionalbüro der Friedrich-Naumann-Stiftung in Washington, D.C. Parallel arbeite ich an den fertigungstechnischen Grundlagen, die mir fehlen, vor allem an Werkstoffkunde und den gängigen Umform- und Fügeverfahren.</w:t>
       </w:r>
     </w:p>
     <w:p>

</xml_diff>